<commit_message>
docs: update resume (remove part-time assistants line)
</commit_message>
<xml_diff>
--- a/public/documents/Mary_Joyce_Ablanque_AI_Automation_Resume_FINAL.docx
+++ b/public/documents/Mary_Joyce_Ablanque_AI_Automation_Resume_FINAL.docx
@@ -390,24 +390,6 @@
           <w:szCs w:val="21"/>
         </w:rPr>
         <w:t xml:space="preserve">Maintained sales, expense, inventory, purchasing, and supplier records to support financial tracking and daily business decisions.</w:t>
-      </w:r>
-    </w:p>
-    <w:p>
-      <w:pPr>
-        <w:pStyle w:val="ListParagraph"/>
-        <w:numPr>
-          <w:ilvl w:val="0"/>
-          <w:numId w:val="2"/>
-        </w:numPr>
-        <w:spacing w:after="40"/>
-      </w:pPr>
-      <w:r>
-        <w:rPr>
-          <w:rFonts w:ascii="Calibri" w:cs="Calibri" w:eastAsia="Calibri" w:hAnsi="Calibri"/>
-          <w:sz w:val="21"/>
-          <w:szCs w:val="21"/>
-        </w:rPr>
-        <w:t xml:space="preserve">Supervised two part-time assistants and coordinated operational tasks during higher-volume periods.</w:t>
       </w:r>
     </w:p>
     <w:p>

</xml_diff>